<commit_message>
First Decision Log updated based on Ruud's Reflection System Prompt with Claude
</commit_message>
<xml_diff>
--- a/Docs/3- DL's/Decision-log-1-Project-Decision(Upadet-Version).docx
+++ b/Docs/3- DL's/Decision-log-1-Project-Decision(Upadet-Version).docx
@@ -27,10 +27,8 @@
       <w:r>
         <w:t>Why this matters right now: Without choosing a project, I cannot start my research and experimentation. Since my semester is based on GenAI projects, I need to select a project in order to begin working and to be assessed by teachers.</w:t>
       </w:r>
-    </w:p>
-    <w:p>
       <w:r>
-        <w:t>Where this fits: -----</w:t>
+        <w:tab/>
       </w:r>
     </w:p>
     <w:p>
@@ -55,8 +53,117 @@
       </w:r>
     </w:p>
     <w:p>
+      <w:pPr>
+        <w:rPr>
+          <w:lang w:val="en-GB"/>
+        </w:rPr>
+      </w:pPr>
       <w:r>
+        <w:rPr>
+          <w:rFonts w:ascii="Segoe UI Symbol" w:hAnsi="Segoe UI Symbol" w:cs="Segoe UI Symbol"/>
+          <w:lang w:val="en-GB"/>
+        </w:rPr>
+        <w:t>☑</w:t>
+      </w:r>
+      <w:r>
+        <w:rPr>
+          <w:lang w:val="en-GB"/>
+        </w:rPr>
+        <w:t xml:space="preserve"> </w:t>
+      </w:r>
+      <w:proofErr w:type="spellStart"/>
+      <w:r>
+        <w:rPr>
+          <w:b/>
+          <w:bCs/>
+          <w:lang w:val="en-GB"/>
+        </w:rPr>
         <w:t>Analyzing</w:t>
+      </w:r>
+      <w:proofErr w:type="spellEnd"/>
+      <w:r>
+        <w:rPr>
+          <w:lang w:val="en-GB"/>
+        </w:rPr>
+        <w:br/>
+      </w:r>
+      <w:r>
+        <w:rPr>
+          <w:rFonts w:ascii="Segoe UI Symbol" w:hAnsi="Segoe UI Symbol" w:cs="Segoe UI Symbol"/>
+          <w:lang w:val="en-GB"/>
+        </w:rPr>
+        <w:t>☐</w:t>
+      </w:r>
+      <w:r>
+        <w:rPr>
+          <w:b/>
+          <w:bCs/>
+          <w:lang w:val="en-GB"/>
+        </w:rPr>
+        <w:t xml:space="preserve"> </w:t>
+      </w:r>
+      <w:r>
+        <w:rPr>
+          <w:lang w:val="en-GB"/>
+        </w:rPr>
+        <w:t>Advising</w:t>
+      </w:r>
+      <w:r>
+        <w:rPr>
+          <w:lang w:val="en-GB"/>
+        </w:rPr>
+        <w:br/>
+      </w:r>
+      <w:r>
+        <w:rPr>
+          <w:rFonts w:ascii="Segoe UI Symbol" w:hAnsi="Segoe UI Symbol" w:cs="Segoe UI Symbol"/>
+          <w:lang w:val="en-GB"/>
+        </w:rPr>
+        <w:t>☐</w:t>
+      </w:r>
+      <w:r>
+        <w:rPr>
+          <w:lang w:val="en-GB"/>
+        </w:rPr>
+        <w:t xml:space="preserve"> Designing</w:t>
+      </w:r>
+      <w:r>
+        <w:rPr>
+          <w:lang w:val="en-GB"/>
+        </w:rPr>
+        <w:br/>
+      </w:r>
+      <w:r>
+        <w:rPr>
+          <w:rFonts w:ascii="Segoe UI Symbol" w:hAnsi="Segoe UI Symbol" w:cs="Segoe UI Symbol"/>
+          <w:lang w:val="en-GB"/>
+        </w:rPr>
+        <w:t>☐</w:t>
+      </w:r>
+      <w:r>
+        <w:rPr>
+          <w:lang w:val="en-GB"/>
+        </w:rPr>
+        <w:t xml:space="preserve"> Realizing</w:t>
+      </w:r>
+      <w:r>
+        <w:rPr>
+          <w:lang w:val="en-GB"/>
+        </w:rPr>
+        <w:br/>
+      </w:r>
+      <w:r>
+        <w:rPr>
+          <w:rFonts w:ascii="Segoe UI Symbol" w:hAnsi="Segoe UI Symbol" w:cs="Segoe UI Symbol"/>
+          <w:lang w:val="en-GB"/>
+        </w:rPr>
+        <w:t>☐</w:t>
+      </w:r>
+      <w:r>
+        <w:rPr>
+          <w:lang w:val="en-GB"/>
+        </w:rPr>
+        <w:t xml:space="preserve"> Managing</w:t>
       </w:r>
     </w:p>
     <w:p>
@@ -141,12 +248,19 @@
           <w:lang w:val="en-GB"/>
         </w:rPr>
         <w:br/>
-        <w:t>I compared the available project options and evaluated how well they matched my role and learning goals.</w:t>
+      </w:r>
+      <w:r>
+        <w:rPr>
+          <w:lang w:val="en-GB"/>
+        </w:rPr>
+        <w:t>I compared the available project options and evaluated how well they matched my role and learning goals. To do this, I reviewed the project descriptions and compared how each project aligns with my GenAI Engineer role. I also documented this comparison in my Project Understanding and GenAI Role reflection documents.</w:t>
       </w:r>
     </w:p>
     <w:p>
       <w:pPr>
         <w:rPr>
+          <w:b/>
+          <w:bCs/>
           <w:lang w:val="en-GB"/>
         </w:rPr>
       </w:pPr>
@@ -161,84 +275,27 @@
     </w:p>
     <w:p>
       <w:pPr>
+        <w:pStyle w:val="ListParagraph"/>
         <w:numPr>
           <w:ilvl w:val="0"/>
-          <w:numId w:val="10"/>
+          <w:numId w:val="13"/>
         </w:numPr>
-        <w:rPr>
-          <w:lang w:val="en-GB"/>
-        </w:rPr>
-      </w:pPr>
-      <w:r>
-        <w:rPr>
-          <w:lang w:val="en-GB"/>
-        </w:rPr>
-        <w:t>Some projects such as ‘</w:t>
-      </w:r>
-      <w:r>
-        <w:rPr>
-          <w:lang w:val="en-GB"/>
-        </w:rPr>
-        <w:t xml:space="preserve">The </w:t>
-      </w:r>
-      <w:r>
         <w:rPr>
           <w:b/>
           <w:bCs/>
           <w:lang w:val="en-GB"/>
         </w:rPr>
-        <w:t>Toys R Us</w:t>
-      </w:r>
-      <w:r>
-        <w:rPr>
-          <w:b/>
-          <w:bCs/>
-          <w:lang w:val="en-GB"/>
-        </w:rPr>
-        <w:t>’</w:t>
-      </w:r>
-      <w:r>
-        <w:rPr>
-          <w:b/>
-          <w:bCs/>
-          <w:lang w:val="en-GB"/>
-        </w:rPr>
-        <w:t xml:space="preserve"> project</w:t>
-      </w:r>
+      </w:pPr>
       <w:r>
         <w:rPr>
           <w:lang w:val="en-GB"/>
         </w:rPr>
-        <w:t xml:space="preserve"> focuses more on the Designer role.</w:t>
-      </w:r>
-    </w:p>
-    <w:p>
-      <w:pPr>
-        <w:numPr>
-          <w:ilvl w:val="0"/>
-          <w:numId w:val="10"/>
-        </w:numPr>
-        <w:rPr>
-          <w:lang w:val="en-GB"/>
-        </w:rPr>
-      </w:pPr>
-      <w:r>
-        <w:rPr>
-          <w:lang w:val="en-GB"/>
-        </w:rPr>
-        <w:t>Some projects such as  ‘</w:t>
-      </w:r>
-      <w:r>
-        <w:rPr>
-          <w:lang w:val="en-GB"/>
-        </w:rPr>
-        <w:t xml:space="preserve">The </w:t>
+        <w:lastRenderedPageBreak/>
+        <w:t xml:space="preserve">Among the available project options, several projects were aligned with different roles. For example, the Toys R Us project focuses on the Experience Designer role, while the </w:t>
       </w:r>
       <w:proofErr w:type="spellStart"/>
       <w:r>
         <w:rPr>
-          <w:b/>
-          <w:bCs/>
           <w:lang w:val="en-GB"/>
         </w:rPr>
         <w:t>Reclam</w:t>
@@ -246,46 +303,28 @@
       <w:proofErr w:type="spellEnd"/>
       <w:r>
         <w:rPr>
-          <w:b/>
-          <w:bCs/>
           <w:lang w:val="en-GB"/>
         </w:rPr>
-        <w:t xml:space="preserve"> Bureau</w:t>
+        <w:t xml:space="preserve"> Bureau project focuses on system architecture and the GenAI Architect role.</w:t>
       </w:r>
-      <w:r>
+    </w:p>
+    <w:p>
+      <w:pPr>
+        <w:pStyle w:val="ListParagraph"/>
+        <w:numPr>
+          <w:ilvl w:val="0"/>
+          <w:numId w:val="13"/>
+        </w:numPr>
         <w:rPr>
           <w:b/>
           <w:bCs/>
           <w:lang w:val="en-GB"/>
         </w:rPr>
-        <w:t>’</w:t>
-      </w:r>
-      <w:r>
-        <w:rPr>
-          <w:b/>
-          <w:bCs/>
-          <w:lang w:val="en-GB"/>
-        </w:rPr>
-        <w:t xml:space="preserve"> project</w:t>
-      </w:r>
+      </w:pPr>
       <w:r>
         <w:rPr>
           <w:lang w:val="en-GB"/>
         </w:rPr>
-        <w:t xml:space="preserve"> focuses more on the Architect role.</w:t>
-      </w:r>
-    </w:p>
-    <w:p>
-      <w:pPr>
-        <w:rPr>
-          <w:lang w:val="en-GB"/>
-        </w:rPr>
-      </w:pPr>
-      <w:r>
-        <w:rPr>
-          <w:lang w:val="en-GB"/>
-        </w:rPr>
-        <w:lastRenderedPageBreak/>
         <w:t xml:space="preserve">Based on my role reflection, I align more with the </w:t>
       </w:r>
       <w:r>
@@ -305,7 +344,14 @@
     </w:p>
     <w:p>
       <w:pPr>
+        <w:pStyle w:val="ListParagraph"/>
+        <w:numPr>
+          <w:ilvl w:val="0"/>
+          <w:numId w:val="13"/>
+        </w:numPr>
         <w:rPr>
+          <w:b/>
+          <w:bCs/>
           <w:lang w:val="en-GB"/>
         </w:rPr>
       </w:pPr>
@@ -332,7 +378,14 @@
     </w:p>
     <w:p>
       <w:pPr>
+        <w:pStyle w:val="ListParagraph"/>
+        <w:numPr>
+          <w:ilvl w:val="0"/>
+          <w:numId w:val="13"/>
+        </w:numPr>
         <w:rPr>
+          <w:b/>
+          <w:bCs/>
           <w:lang w:val="en-GB"/>
         </w:rPr>
       </w:pPr>
@@ -374,14 +427,24 @@
         </w:numPr>
       </w:pPr>
       <w:hyperlink r:id="rId6" w:history="1">
-        <w:proofErr w:type="spellStart"/>
         <w:r>
           <w:rPr>
             <w:rStyle w:val="Hyperlink"/>
           </w:rPr>
-          <w:t>My_GenAI_Specialization_Role</w:t>
+          <w:t>Project</w:t>
         </w:r>
-        <w:proofErr w:type="spellEnd"/>
+        <w:r>
+          <w:rPr>
+            <w:rStyle w:val="Hyperlink"/>
+          </w:rPr>
+          <w:t xml:space="preserve"> </w:t>
+        </w:r>
+        <w:r>
+          <w:rPr>
+            <w:rStyle w:val="Hyperlink"/>
+          </w:rPr>
+          <w:t>Comparison</w:t>
+        </w:r>
       </w:hyperlink>
     </w:p>
     <w:p>
@@ -391,25 +454,88 @@
           <w:ilvl w:val="0"/>
           <w:numId w:val="11"/>
         </w:numPr>
-      </w:pPr>
-      <w:hyperlink r:id="rId7" w:history="1">
-        <w:proofErr w:type="spellStart"/>
-        <w:r>
-          <w:rPr>
-            <w:rStyle w:val="Hyperlink"/>
-          </w:rPr>
-          <w:t>StachEval</w:t>
-        </w:r>
-        <w:proofErr w:type="spellEnd"/>
-        <w:r>
-          <w:rPr>
-            <w:rStyle w:val="Hyperlink"/>
-          </w:rPr>
-          <w:t>-Project-Understanding</w:t>
-        </w:r>
-      </w:hyperlink>
+        <w:rPr>
+          <w:rStyle w:val="Hyperlink"/>
+        </w:rPr>
+      </w:pPr>
+      <w:r>
+        <w:fldChar w:fldCharType="begin"/>
+      </w:r>
+      <w:r>
+        <w:instrText>HYPERLINK "../4-%20Research%20Docs%20and%20Test%20Docs/1-%20My_GenAI_Specialization_Role.pdf"</w:instrText>
+      </w:r>
+      <w:r>
+        <w:fldChar w:fldCharType="separate"/>
+      </w:r>
+      <w:r>
+        <w:rPr>
+          <w:rStyle w:val="Hyperlink"/>
+        </w:rPr>
+        <w:t>My GenAI Role</w:t>
+      </w:r>
     </w:p>
     <w:p>
+      <w:pPr>
+        <w:pStyle w:val="ListParagraph"/>
+        <w:numPr>
+          <w:ilvl w:val="0"/>
+          <w:numId w:val="11"/>
+        </w:numPr>
+        <w:rPr>
+          <w:rStyle w:val="Hyperlink"/>
+          <w:color w:val="auto"/>
+          <w:u w:val="none"/>
+        </w:rPr>
+      </w:pPr>
+      <w:r>
+        <w:fldChar w:fldCharType="end"/>
+      </w:r>
+      <w:r>
+        <w:fldChar w:fldCharType="begin"/>
+      </w:r>
+      <w:r>
+        <w:instrText>HYPERLINK "../4-%20Research%20Docs%20and%20Test%20Docs/1-%20StackEval_Project_Understanding.pdf"</w:instrText>
+      </w:r>
+      <w:r>
+        <w:fldChar w:fldCharType="separate"/>
+      </w:r>
+      <w:proofErr w:type="spellStart"/>
+      <w:r>
+        <w:rPr>
+          <w:rStyle w:val="Hyperlink"/>
+        </w:rPr>
+        <w:t>StachEval</w:t>
+      </w:r>
+      <w:proofErr w:type="spellEnd"/>
+      <w:r>
+        <w:rPr>
+          <w:rStyle w:val="Hyperlink"/>
+        </w:rPr>
+        <w:t>-Project-Underst</w:t>
+      </w:r>
+      <w:r>
+        <w:rPr>
+          <w:rStyle w:val="Hyperlink"/>
+        </w:rPr>
+        <w:t>a</w:t>
+      </w:r>
+      <w:r>
+        <w:rPr>
+          <w:rStyle w:val="Hyperlink"/>
+        </w:rPr>
+        <w:t>nding</w:t>
+      </w:r>
+      <w:r>
+        <w:rPr>
+          <w:rStyle w:val="Hyperlink"/>
+        </w:rPr>
+        <w:t xml:space="preserve"> </w:t>
+      </w:r>
+    </w:p>
+    <w:p>
+      <w:r>
+        <w:fldChar w:fldCharType="end"/>
+      </w:r>
       <w:r>
         <w:rPr>
           <w:b/>
@@ -584,6 +710,7 @@
     </w:p>
     <w:p>
       <w:r>
+        <w:lastRenderedPageBreak/>
         <w:t>One interesting part of this project is that I will show model answers to real developers and ask them to evaluate and score them. This motivates me because it allows me to learn from real feedback and see how developers judge the usefulness of AI-generated answers.</w:t>
       </w:r>
     </w:p>
@@ -602,7 +729,6 @@
     </w:p>
     <w:p>
       <w:r>
-        <w:lastRenderedPageBreak/>
         <w:t xml:space="preserve">Next LO stage: </w:t>
       </w:r>
       <w:r>
@@ -994,6 +1120,268 @@
     </w:lvl>
   </w:abstractNum>
   <w:abstractNum w:abstractNumId="10" w15:restartNumberingAfterBreak="0">
+    <w:nsid w:val="4544048B"/>
+    <w:multiLevelType w:val="hybridMultilevel"/>
+    <w:tmpl w:val="D25E0902"/>
+    <w:lvl w:ilvl="0" w:tplc="08090001">
+      <w:start w:val="1"/>
+      <w:numFmt w:val="bullet"/>
+      <w:lvlText w:val=""/>
+      <w:lvlJc w:val="left"/>
+      <w:pPr>
+        <w:ind w:left="720" w:hanging="360"/>
+      </w:pPr>
+      <w:rPr>
+        <w:rFonts w:ascii="Symbol" w:hAnsi="Symbol" w:hint="default"/>
+      </w:rPr>
+    </w:lvl>
+    <w:lvl w:ilvl="1" w:tplc="08090003" w:tentative="1">
+      <w:start w:val="1"/>
+      <w:numFmt w:val="bullet"/>
+      <w:lvlText w:val="o"/>
+      <w:lvlJc w:val="left"/>
+      <w:pPr>
+        <w:ind w:left="1440" w:hanging="360"/>
+      </w:pPr>
+      <w:rPr>
+        <w:rFonts w:ascii="Courier New" w:hAnsi="Courier New" w:cs="Courier New" w:hint="default"/>
+      </w:rPr>
+    </w:lvl>
+    <w:lvl w:ilvl="2" w:tplc="08090005" w:tentative="1">
+      <w:start w:val="1"/>
+      <w:numFmt w:val="bullet"/>
+      <w:lvlText w:val=""/>
+      <w:lvlJc w:val="left"/>
+      <w:pPr>
+        <w:ind w:left="2160" w:hanging="360"/>
+      </w:pPr>
+      <w:rPr>
+        <w:rFonts w:ascii="Wingdings" w:hAnsi="Wingdings" w:hint="default"/>
+      </w:rPr>
+    </w:lvl>
+    <w:lvl w:ilvl="3" w:tplc="08090001" w:tentative="1">
+      <w:start w:val="1"/>
+      <w:numFmt w:val="bullet"/>
+      <w:lvlText w:val=""/>
+      <w:lvlJc w:val="left"/>
+      <w:pPr>
+        <w:ind w:left="2880" w:hanging="360"/>
+      </w:pPr>
+      <w:rPr>
+        <w:rFonts w:ascii="Symbol" w:hAnsi="Symbol" w:hint="default"/>
+      </w:rPr>
+    </w:lvl>
+    <w:lvl w:ilvl="4" w:tplc="08090003" w:tentative="1">
+      <w:start w:val="1"/>
+      <w:numFmt w:val="bullet"/>
+      <w:lvlText w:val="o"/>
+      <w:lvlJc w:val="left"/>
+      <w:pPr>
+        <w:ind w:left="3600" w:hanging="360"/>
+      </w:pPr>
+      <w:rPr>
+        <w:rFonts w:ascii="Courier New" w:hAnsi="Courier New" w:cs="Courier New" w:hint="default"/>
+      </w:rPr>
+    </w:lvl>
+    <w:lvl w:ilvl="5" w:tplc="08090005" w:tentative="1">
+      <w:start w:val="1"/>
+      <w:numFmt w:val="bullet"/>
+      <w:lvlText w:val=""/>
+      <w:lvlJc w:val="left"/>
+      <w:pPr>
+        <w:ind w:left="4320" w:hanging="360"/>
+      </w:pPr>
+      <w:rPr>
+        <w:rFonts w:ascii="Wingdings" w:hAnsi="Wingdings" w:hint="default"/>
+      </w:rPr>
+    </w:lvl>
+    <w:lvl w:ilvl="6" w:tplc="08090001" w:tentative="1">
+      <w:start w:val="1"/>
+      <w:numFmt w:val="bullet"/>
+      <w:lvlText w:val=""/>
+      <w:lvlJc w:val="left"/>
+      <w:pPr>
+        <w:ind w:left="5040" w:hanging="360"/>
+      </w:pPr>
+      <w:rPr>
+        <w:rFonts w:ascii="Symbol" w:hAnsi="Symbol" w:hint="default"/>
+      </w:rPr>
+    </w:lvl>
+    <w:lvl w:ilvl="7" w:tplc="08090003" w:tentative="1">
+      <w:start w:val="1"/>
+      <w:numFmt w:val="bullet"/>
+      <w:lvlText w:val="o"/>
+      <w:lvlJc w:val="left"/>
+      <w:pPr>
+        <w:ind w:left="5760" w:hanging="360"/>
+      </w:pPr>
+      <w:rPr>
+        <w:rFonts w:ascii="Courier New" w:hAnsi="Courier New" w:cs="Courier New" w:hint="default"/>
+      </w:rPr>
+    </w:lvl>
+    <w:lvl w:ilvl="8" w:tplc="08090005" w:tentative="1">
+      <w:start w:val="1"/>
+      <w:numFmt w:val="bullet"/>
+      <w:lvlText w:val=""/>
+      <w:lvlJc w:val="left"/>
+      <w:pPr>
+        <w:ind w:left="6480" w:hanging="360"/>
+      </w:pPr>
+      <w:rPr>
+        <w:rFonts w:ascii="Wingdings" w:hAnsi="Wingdings" w:hint="default"/>
+      </w:rPr>
+    </w:lvl>
+  </w:abstractNum>
+  <w:abstractNum w:abstractNumId="11" w15:restartNumberingAfterBreak="0">
+    <w:nsid w:val="56304439"/>
+    <w:multiLevelType w:val="multilevel"/>
+    <w:tmpl w:val="E3886A54"/>
+    <w:lvl w:ilvl="0">
+      <w:start w:val="1"/>
+      <w:numFmt w:val="bullet"/>
+      <w:lvlText w:val=""/>
+      <w:lvlJc w:val="left"/>
+      <w:pPr>
+        <w:tabs>
+          <w:tab w:val="num" w:pos="720"/>
+        </w:tabs>
+        <w:ind w:left="720" w:hanging="360"/>
+      </w:pPr>
+      <w:rPr>
+        <w:rFonts w:ascii="Symbol" w:hAnsi="Symbol" w:hint="default"/>
+        <w:sz w:val="20"/>
+      </w:rPr>
+    </w:lvl>
+    <w:lvl w:ilvl="1" w:tentative="1">
+      <w:start w:val="1"/>
+      <w:numFmt w:val="bullet"/>
+      <w:lvlText w:val="o"/>
+      <w:lvlJc w:val="left"/>
+      <w:pPr>
+        <w:tabs>
+          <w:tab w:val="num" w:pos="1440"/>
+        </w:tabs>
+        <w:ind w:left="1440" w:hanging="360"/>
+      </w:pPr>
+      <w:rPr>
+        <w:rFonts w:ascii="Courier New" w:hAnsi="Courier New" w:hint="default"/>
+        <w:sz w:val="20"/>
+      </w:rPr>
+    </w:lvl>
+    <w:lvl w:ilvl="2" w:tentative="1">
+      <w:start w:val="1"/>
+      <w:numFmt w:val="bullet"/>
+      <w:lvlText w:val=""/>
+      <w:lvlJc w:val="left"/>
+      <w:pPr>
+        <w:tabs>
+          <w:tab w:val="num" w:pos="2160"/>
+        </w:tabs>
+        <w:ind w:left="2160" w:hanging="360"/>
+      </w:pPr>
+      <w:rPr>
+        <w:rFonts w:ascii="Wingdings" w:hAnsi="Wingdings" w:hint="default"/>
+        <w:sz w:val="20"/>
+      </w:rPr>
+    </w:lvl>
+    <w:lvl w:ilvl="3" w:tentative="1">
+      <w:start w:val="1"/>
+      <w:numFmt w:val="bullet"/>
+      <w:lvlText w:val=""/>
+      <w:lvlJc w:val="left"/>
+      <w:pPr>
+        <w:tabs>
+          <w:tab w:val="num" w:pos="2880"/>
+        </w:tabs>
+        <w:ind w:left="2880" w:hanging="360"/>
+      </w:pPr>
+      <w:rPr>
+        <w:rFonts w:ascii="Wingdings" w:hAnsi="Wingdings" w:hint="default"/>
+        <w:sz w:val="20"/>
+      </w:rPr>
+    </w:lvl>
+    <w:lvl w:ilvl="4" w:tentative="1">
+      <w:start w:val="1"/>
+      <w:numFmt w:val="bullet"/>
+      <w:lvlText w:val=""/>
+      <w:lvlJc w:val="left"/>
+      <w:pPr>
+        <w:tabs>
+          <w:tab w:val="num" w:pos="3600"/>
+        </w:tabs>
+        <w:ind w:left="3600" w:hanging="360"/>
+      </w:pPr>
+      <w:rPr>
+        <w:rFonts w:ascii="Wingdings" w:hAnsi="Wingdings" w:hint="default"/>
+        <w:sz w:val="20"/>
+      </w:rPr>
+    </w:lvl>
+    <w:lvl w:ilvl="5" w:tentative="1">
+      <w:start w:val="1"/>
+      <w:numFmt w:val="bullet"/>
+      <w:lvlText w:val=""/>
+      <w:lvlJc w:val="left"/>
+      <w:pPr>
+        <w:tabs>
+          <w:tab w:val="num" w:pos="4320"/>
+        </w:tabs>
+        <w:ind w:left="4320" w:hanging="360"/>
+      </w:pPr>
+      <w:rPr>
+        <w:rFonts w:ascii="Wingdings" w:hAnsi="Wingdings" w:hint="default"/>
+        <w:sz w:val="20"/>
+      </w:rPr>
+    </w:lvl>
+    <w:lvl w:ilvl="6" w:tentative="1">
+      <w:start w:val="1"/>
+      <w:numFmt w:val="bullet"/>
+      <w:lvlText w:val=""/>
+      <w:lvlJc w:val="left"/>
+      <w:pPr>
+        <w:tabs>
+          <w:tab w:val="num" w:pos="5040"/>
+        </w:tabs>
+        <w:ind w:left="5040" w:hanging="360"/>
+      </w:pPr>
+      <w:rPr>
+        <w:rFonts w:ascii="Wingdings" w:hAnsi="Wingdings" w:hint="default"/>
+        <w:sz w:val="20"/>
+      </w:rPr>
+    </w:lvl>
+    <w:lvl w:ilvl="7" w:tentative="1">
+      <w:start w:val="1"/>
+      <w:numFmt w:val="bullet"/>
+      <w:lvlText w:val=""/>
+      <w:lvlJc w:val="left"/>
+      <w:pPr>
+        <w:tabs>
+          <w:tab w:val="num" w:pos="5760"/>
+        </w:tabs>
+        <w:ind w:left="5760" w:hanging="360"/>
+      </w:pPr>
+      <w:rPr>
+        <w:rFonts w:ascii="Wingdings" w:hAnsi="Wingdings" w:hint="default"/>
+        <w:sz w:val="20"/>
+      </w:rPr>
+    </w:lvl>
+    <w:lvl w:ilvl="8" w:tentative="1">
+      <w:start w:val="1"/>
+      <w:numFmt w:val="bullet"/>
+      <w:lvlText w:val=""/>
+      <w:lvlJc w:val="left"/>
+      <w:pPr>
+        <w:tabs>
+          <w:tab w:val="num" w:pos="6480"/>
+        </w:tabs>
+        <w:ind w:left="6480" w:hanging="360"/>
+      </w:pPr>
+      <w:rPr>
+        <w:rFonts w:ascii="Wingdings" w:hAnsi="Wingdings" w:hint="default"/>
+        <w:sz w:val="20"/>
+      </w:rPr>
+    </w:lvl>
+  </w:abstractNum>
+  <w:abstractNum w:abstractNumId="12" w15:restartNumberingAfterBreak="0">
     <w:nsid w:val="6D5E0CEC"/>
     <w:multiLevelType w:val="hybridMultilevel"/>
     <w:tmpl w:val="ED1C1090"/>
@@ -1137,6 +1525,12 @@
     <w:abstractNumId w:val="9"/>
   </w:num>
   <w:num w:numId="11" w16cid:durableId="701635221">
+    <w:abstractNumId w:val="12"/>
+  </w:num>
+  <w:num w:numId="12" w16cid:durableId="1032800657">
+    <w:abstractNumId w:val="11"/>
+  </w:num>
+  <w:num w:numId="13" w16cid:durableId="1878007370">
     <w:abstractNumId w:val="10"/>
   </w:num>
 </w:numbering>
@@ -12544,6 +12938,31 @@
       <w:shd w:val="clear" w:color="auto" w:fill="E1DFDD"/>
     </w:rPr>
   </w:style>
+  <w:style w:type="paragraph" w:styleId="NormalWeb">
+    <w:name w:val="Normal (Web)"/>
+    <w:basedOn w:val="Normal"/>
+    <w:uiPriority w:val="99"/>
+    <w:semiHidden/>
+    <w:unhideWhenUsed/>
+    <w:rsid w:val="00225058"/>
+    <w:rPr>
+      <w:rFonts w:ascii="Times New Roman" w:hAnsi="Times New Roman" w:cs="Times New Roman"/>
+      <w:sz w:val="24"/>
+      <w:szCs w:val="24"/>
+    </w:rPr>
+  </w:style>
+  <w:style w:type="character" w:styleId="FollowedHyperlink">
+    <w:name w:val="FollowedHyperlink"/>
+    <w:basedOn w:val="DefaultParagraphFont"/>
+    <w:uiPriority w:val="99"/>
+    <w:semiHidden/>
+    <w:unhideWhenUsed/>
+    <w:rsid w:val="00225058"/>
+    <w:rPr>
+      <w:color w:val="800080" w:themeColor="followedHyperlink"/>
+      <w:u w:val="single"/>
+    </w:rPr>
+  </w:style>
 </w:styles>
 </file>
 

</xml_diff>